<commit_message>
virsion 1.1 (Rework docks, product cards, was added warning of peptides)
</commit_message>
<xml_diff>
--- a/public/data/PrivacyPolicy.docx
+++ b/public/data/PrivacyPolicy.docx
@@ -61,6 +61,7 @@
         </w:rPr>
         <w:t xml:space="preserve">Персональных данных посетителей сайта </w:t>
       </w:r>
+      <w:proofErr w:type="spellStart"/>
       <w:r>
         <w:rPr>
           <w:rFonts w:ascii="Arial" w:eastAsia="Times New Roman" w:hAnsi="Arial" w:cs="Arial"/>
@@ -73,6 +74,7 @@
         </w:rPr>
         <w:t>Xymerapeptides</w:t>
       </w:r>
+      <w:proofErr w:type="spellEnd"/>
       <w:r>
         <w:rPr>
           <w:rFonts w:ascii="Arial" w:eastAsia="Times New Roman" w:hAnsi="Arial" w:cs="Arial"/>
@@ -95,7 +97,7 @@
           <w:lang w:val="en-US" w:eastAsia="ru-RU"/>
           <w14:ligatures w14:val="none"/>
         </w:rPr>
-        <w:t>ru</w:t>
+        <w:t>com</w:t>
       </w:r>
     </w:p>
     <w:p>
@@ -545,8 +547,22 @@
           <w:lang w:eastAsia="ru-RU"/>
           <w14:ligatures w14:val="none"/>
         </w:rPr>
-        <w:t>• Email</w:t>
-      </w:r>
+        <w:t xml:space="preserve">• </w:t>
+      </w:r>
+      <w:proofErr w:type="spellStart"/>
+      <w:r>
+        <w:rPr>
+          <w:rFonts w:ascii="Arial" w:eastAsia="Times New Roman" w:hAnsi="Arial" w:cs="Arial"/>
+          <w:color w:val="1F1F1F"/>
+          <w:kern w:val="0"/>
+          <w:sz w:val="39"/>
+          <w:szCs w:val="39"/>
+          <w:lang w:eastAsia="ru-RU"/>
+          <w14:ligatures w14:val="none"/>
+        </w:rPr>
+        <w:t>Email</w:t>
+      </w:r>
+      <w:proofErr w:type="spellEnd"/>
     </w:p>
     <w:p>
       <w:pPr>
@@ -816,8 +832,22 @@
           <w:lang w:eastAsia="ru-RU"/>
           <w14:ligatures w14:val="none"/>
         </w:rPr>
-        <w:t>• Email</w:t>
-      </w:r>
+        <w:t xml:space="preserve">• </w:t>
+      </w:r>
+      <w:proofErr w:type="spellStart"/>
+      <w:r>
+        <w:rPr>
+          <w:rFonts w:ascii="Arial" w:eastAsia="Times New Roman" w:hAnsi="Arial" w:cs="Arial"/>
+          <w:color w:val="1F1F1F"/>
+          <w:kern w:val="0"/>
+          <w:sz w:val="39"/>
+          <w:szCs w:val="39"/>
+          <w:lang w:eastAsia="ru-RU"/>
+          <w14:ligatures w14:val="none"/>
+        </w:rPr>
+        <w:t>Email</w:t>
+      </w:r>
+      <w:proofErr w:type="spellEnd"/>
     </w:p>
     <w:p>
       <w:pPr>
@@ -951,7 +981,33 @@
           <w:lang w:eastAsia="ru-RU"/>
           <w14:ligatures w14:val="none"/>
         </w:rPr>
-        <w:t>Использование файлов cookie (куки):</w:t>
+        <w:t xml:space="preserve">Использование файлов </w:t>
+      </w:r>
+      <w:proofErr w:type="spellStart"/>
+      <w:r>
+        <w:rPr>
+          <w:rFonts w:ascii="Arial" w:eastAsia="Times New Roman" w:hAnsi="Arial" w:cs="Arial"/>
+          <w:color w:val="1F1F1F"/>
+          <w:kern w:val="0"/>
+          <w:sz w:val="39"/>
+          <w:szCs w:val="39"/>
+          <w:lang w:eastAsia="ru-RU"/>
+          <w14:ligatures w14:val="none"/>
+        </w:rPr>
+        <w:t>cookie</w:t>
+      </w:r>
+      <w:proofErr w:type="spellEnd"/>
+      <w:r>
+        <w:rPr>
+          <w:rFonts w:ascii="Arial" w:eastAsia="Times New Roman" w:hAnsi="Arial" w:cs="Arial"/>
+          <w:color w:val="1F1F1F"/>
+          <w:kern w:val="0"/>
+          <w:sz w:val="39"/>
+          <w:szCs w:val="39"/>
+          <w:lang w:eastAsia="ru-RU"/>
+          <w14:ligatures w14:val="none"/>
+        </w:rPr>
+        <w:t xml:space="preserve"> (куки):</w:t>
       </w:r>
     </w:p>
     <w:p>
@@ -979,88 +1035,296 @@
           <w14:ligatures w14:val="none"/>
         </w:rPr>
         <w:lastRenderedPageBreak/>
-        <w:t>Файлы cookie (куки) — это небольшие текстовые файлы, которые сохраняются на устройстве пользователя сайта (компьютере, смартфоне или планшете) при посещении сайта. Они помогают улучшить работу сайта, запоминают предпочтения пользователя сайта и анализируют поведение пользователя сайта.</w:t>
-      </w:r>
-    </w:p>
-    <w:p>
-      <w:pPr>
-        <w:shd w:val="clear" w:color="auto" w:fill="FFFFFF"/>
-        <w:spacing w:before="100" w:beforeAutospacing="1" w:after="433" w:line="240" w:lineRule="auto"/>
-        <w:rPr>
-          <w:rFonts w:ascii="Arial" w:eastAsia="Times New Roman" w:hAnsi="Arial" w:cs="Arial"/>
-          <w:color w:val="1F1F1F"/>
-          <w:kern w:val="0"/>
-          <w:sz w:val="39"/>
-          <w:szCs w:val="39"/>
-          <w:lang w:eastAsia="ru-RU"/>
-          <w14:ligatures w14:val="none"/>
-        </w:rPr>
-      </w:pPr>
-      <w:r>
-        <w:rPr>
-          <w:rFonts w:ascii="Arial" w:eastAsia="Times New Roman" w:hAnsi="Arial" w:cs="Arial"/>
-          <w:color w:val="1F1F1F"/>
-          <w:kern w:val="0"/>
-          <w:sz w:val="39"/>
-          <w:szCs w:val="39"/>
-          <w:lang w:eastAsia="ru-RU"/>
-          <w14:ligatures w14:val="none"/>
-        </w:rPr>
-        <w:t>На сайте могут применяться следующие виды cookie:</w:t>
-      </w:r>
-    </w:p>
-    <w:p>
-      <w:pPr>
-        <w:shd w:val="clear" w:color="auto" w:fill="FFFFFF"/>
-        <w:spacing w:before="100" w:beforeAutospacing="1" w:after="433" w:line="240" w:lineRule="auto"/>
-        <w:rPr>
-          <w:rFonts w:ascii="Arial" w:eastAsia="Times New Roman" w:hAnsi="Arial" w:cs="Arial"/>
-          <w:color w:val="1F1F1F"/>
-          <w:kern w:val="0"/>
-          <w:sz w:val="39"/>
-          <w:szCs w:val="39"/>
-          <w:lang w:eastAsia="ru-RU"/>
-          <w14:ligatures w14:val="none"/>
-        </w:rPr>
-      </w:pPr>
-      <w:r>
-        <w:rPr>
-          <w:rFonts w:ascii="Arial" w:eastAsia="Times New Roman" w:hAnsi="Arial" w:cs="Arial"/>
-          <w:color w:val="1F1F1F"/>
-          <w:kern w:val="0"/>
-          <w:sz w:val="39"/>
-          <w:szCs w:val="39"/>
-          <w:lang w:eastAsia="ru-RU"/>
-          <w14:ligatures w14:val="none"/>
-        </w:rPr>
-        <w:t>Оператор использует сервис Яндекс.Метрика для сбора статистики о посещаемости сайта и поведения пользователей. Этот инструмент помогает анализировать данные о просмотрах страниц, времени на сайте, источниках трафика и других метриках. Пользователь сайта может отказаться от сбора данных Яндекс.Метрикой с помощью официального инструмента отключения. Пользователь сайта может контролировать и удалять cookie через настройки своего браузера. Однако отключение некоторых файлов cookie может повлиять на функциональность сайта.</w:t>
-      </w:r>
-    </w:p>
-    <w:p>
-      <w:pPr>
-        <w:shd w:val="clear" w:color="auto" w:fill="FFFFFF"/>
-        <w:spacing w:before="100" w:beforeAutospacing="1" w:after="433" w:line="240" w:lineRule="auto"/>
-        <w:rPr>
-          <w:rFonts w:ascii="Arial" w:eastAsia="Times New Roman" w:hAnsi="Arial" w:cs="Arial"/>
-          <w:color w:val="1F1F1F"/>
-          <w:kern w:val="0"/>
-          <w:sz w:val="39"/>
-          <w:szCs w:val="39"/>
-          <w:lang w:eastAsia="ru-RU"/>
-          <w14:ligatures w14:val="none"/>
-        </w:rPr>
-      </w:pPr>
-      <w:r>
-        <w:rPr>
-          <w:rFonts w:ascii="Arial" w:eastAsia="Times New Roman" w:hAnsi="Arial" w:cs="Arial"/>
-          <w:color w:val="1F1F1F"/>
-          <w:kern w:val="0"/>
-          <w:sz w:val="39"/>
-          <w:szCs w:val="39"/>
-          <w:lang w:eastAsia="ru-RU"/>
-          <w14:ligatures w14:val="none"/>
-        </w:rPr>
-        <w:t xml:space="preserve">Оператор использует сервис Яндекс.Метрика для сбора статистики о посещаемости сайта и поведения пользователей. Этот инструмент помогает анализировать данные о просмотрах страниц, времени на сайте, источниках трафика и других метриках. Пользователь сайта может отказаться от сбора данных Яндекс.Метрикой с помощью официального инструмента отключения. </w:t>
+        <w:t xml:space="preserve">Файлы </w:t>
+      </w:r>
+      <w:proofErr w:type="spellStart"/>
+      <w:r>
+        <w:rPr>
+          <w:rFonts w:ascii="Arial" w:eastAsia="Times New Roman" w:hAnsi="Arial" w:cs="Arial"/>
+          <w:color w:val="1F1F1F"/>
+          <w:kern w:val="0"/>
+          <w:sz w:val="39"/>
+          <w:szCs w:val="39"/>
+          <w:lang w:eastAsia="ru-RU"/>
+          <w14:ligatures w14:val="none"/>
+        </w:rPr>
+        <w:t>cookie</w:t>
+      </w:r>
+      <w:proofErr w:type="spellEnd"/>
+      <w:r>
+        <w:rPr>
+          <w:rFonts w:ascii="Arial" w:eastAsia="Times New Roman" w:hAnsi="Arial" w:cs="Arial"/>
+          <w:color w:val="1F1F1F"/>
+          <w:kern w:val="0"/>
+          <w:sz w:val="39"/>
+          <w:szCs w:val="39"/>
+          <w:lang w:eastAsia="ru-RU"/>
+          <w14:ligatures w14:val="none"/>
+        </w:rPr>
+        <w:t xml:space="preserve"> (куки) — это небольшие текстовые файлы, которые сохраняются на устройстве пользователя сайта (компьютере, смартфоне или планшете) при посещении сайта. Они помогают улучшить работу сайта, запоминают предпочтения пользователя сайта и анализируют поведение пользователя сайта.</w:t>
+      </w:r>
+    </w:p>
+    <w:p>
+      <w:pPr>
+        <w:shd w:val="clear" w:color="auto" w:fill="FFFFFF"/>
+        <w:spacing w:before="100" w:beforeAutospacing="1" w:after="433" w:line="240" w:lineRule="auto"/>
+        <w:rPr>
+          <w:rFonts w:ascii="Arial" w:eastAsia="Times New Roman" w:hAnsi="Arial" w:cs="Arial"/>
+          <w:color w:val="1F1F1F"/>
+          <w:kern w:val="0"/>
+          <w:sz w:val="39"/>
+          <w:szCs w:val="39"/>
+          <w:lang w:eastAsia="ru-RU"/>
+          <w14:ligatures w14:val="none"/>
+        </w:rPr>
+      </w:pPr>
+      <w:r>
+        <w:rPr>
+          <w:rFonts w:ascii="Arial" w:eastAsia="Times New Roman" w:hAnsi="Arial" w:cs="Arial"/>
+          <w:color w:val="1F1F1F"/>
+          <w:kern w:val="0"/>
+          <w:sz w:val="39"/>
+          <w:szCs w:val="39"/>
+          <w:lang w:eastAsia="ru-RU"/>
+          <w14:ligatures w14:val="none"/>
+        </w:rPr>
+        <w:t xml:space="preserve">На сайте могут применяться следующие виды </w:t>
+      </w:r>
+      <w:proofErr w:type="spellStart"/>
+      <w:r>
+        <w:rPr>
+          <w:rFonts w:ascii="Arial" w:eastAsia="Times New Roman" w:hAnsi="Arial" w:cs="Arial"/>
+          <w:color w:val="1F1F1F"/>
+          <w:kern w:val="0"/>
+          <w:sz w:val="39"/>
+          <w:szCs w:val="39"/>
+          <w:lang w:eastAsia="ru-RU"/>
+          <w14:ligatures w14:val="none"/>
+        </w:rPr>
+        <w:t>cookie</w:t>
+      </w:r>
+      <w:proofErr w:type="spellEnd"/>
+      <w:r>
+        <w:rPr>
+          <w:rFonts w:ascii="Arial" w:eastAsia="Times New Roman" w:hAnsi="Arial" w:cs="Arial"/>
+          <w:color w:val="1F1F1F"/>
+          <w:kern w:val="0"/>
+          <w:sz w:val="39"/>
+          <w:szCs w:val="39"/>
+          <w:lang w:eastAsia="ru-RU"/>
+          <w14:ligatures w14:val="none"/>
+        </w:rPr>
+        <w:t>:</w:t>
+      </w:r>
+    </w:p>
+    <w:p>
+      <w:pPr>
+        <w:shd w:val="clear" w:color="auto" w:fill="FFFFFF"/>
+        <w:spacing w:before="100" w:beforeAutospacing="1" w:after="433" w:line="240" w:lineRule="auto"/>
+        <w:rPr>
+          <w:rFonts w:ascii="Arial" w:eastAsia="Times New Roman" w:hAnsi="Arial" w:cs="Arial"/>
+          <w:color w:val="1F1F1F"/>
+          <w:kern w:val="0"/>
+          <w:sz w:val="39"/>
+          <w:szCs w:val="39"/>
+          <w:lang w:eastAsia="ru-RU"/>
+          <w14:ligatures w14:val="none"/>
+        </w:rPr>
+      </w:pPr>
+      <w:r>
+        <w:rPr>
+          <w:rFonts w:ascii="Arial" w:eastAsia="Times New Roman" w:hAnsi="Arial" w:cs="Arial"/>
+          <w:color w:val="1F1F1F"/>
+          <w:kern w:val="0"/>
+          <w:sz w:val="39"/>
+          <w:szCs w:val="39"/>
+          <w:lang w:eastAsia="ru-RU"/>
+          <w14:ligatures w14:val="none"/>
+        </w:rPr>
+        <w:t xml:space="preserve">Оператор использует сервис </w:t>
+      </w:r>
+      <w:proofErr w:type="spellStart"/>
+      <w:r>
+        <w:rPr>
+          <w:rFonts w:ascii="Arial" w:eastAsia="Times New Roman" w:hAnsi="Arial" w:cs="Arial"/>
+          <w:color w:val="1F1F1F"/>
+          <w:kern w:val="0"/>
+          <w:sz w:val="39"/>
+          <w:szCs w:val="39"/>
+          <w:lang w:eastAsia="ru-RU"/>
+          <w14:ligatures w14:val="none"/>
+        </w:rPr>
+        <w:t>Яндекс.Метрика</w:t>
+      </w:r>
+      <w:proofErr w:type="spellEnd"/>
+      <w:r>
+        <w:rPr>
+          <w:rFonts w:ascii="Arial" w:eastAsia="Times New Roman" w:hAnsi="Arial" w:cs="Arial"/>
+          <w:color w:val="1F1F1F"/>
+          <w:kern w:val="0"/>
+          <w:sz w:val="39"/>
+          <w:szCs w:val="39"/>
+          <w:lang w:eastAsia="ru-RU"/>
+          <w14:ligatures w14:val="none"/>
+        </w:rPr>
+        <w:t xml:space="preserve"> для сбора статистики о посещаемости сайта и поведения пользователей. Этот инструмент помогает анализировать данные о просмотрах страниц, времени на сайте, источниках трафика и других метриках. Пользователь сайта может отказаться от сбора данных </w:t>
+      </w:r>
+      <w:proofErr w:type="spellStart"/>
+      <w:r>
+        <w:rPr>
+          <w:rFonts w:ascii="Arial" w:eastAsia="Times New Roman" w:hAnsi="Arial" w:cs="Arial"/>
+          <w:color w:val="1F1F1F"/>
+          <w:kern w:val="0"/>
+          <w:sz w:val="39"/>
+          <w:szCs w:val="39"/>
+          <w:lang w:eastAsia="ru-RU"/>
+          <w14:ligatures w14:val="none"/>
+        </w:rPr>
+        <w:t>Яндекс.Метрикой</w:t>
+      </w:r>
+      <w:proofErr w:type="spellEnd"/>
+      <w:r>
+        <w:rPr>
+          <w:rFonts w:ascii="Arial" w:eastAsia="Times New Roman" w:hAnsi="Arial" w:cs="Arial"/>
+          <w:color w:val="1F1F1F"/>
+          <w:kern w:val="0"/>
+          <w:sz w:val="39"/>
+          <w:szCs w:val="39"/>
+          <w:lang w:eastAsia="ru-RU"/>
+          <w14:ligatures w14:val="none"/>
+        </w:rPr>
+        <w:t xml:space="preserve"> с помощью официального инструмента отключения. Пользователь сайта может контролировать и удалять </w:t>
+      </w:r>
+      <w:proofErr w:type="spellStart"/>
+      <w:r>
+        <w:rPr>
+          <w:rFonts w:ascii="Arial" w:eastAsia="Times New Roman" w:hAnsi="Arial" w:cs="Arial"/>
+          <w:color w:val="1F1F1F"/>
+          <w:kern w:val="0"/>
+          <w:sz w:val="39"/>
+          <w:szCs w:val="39"/>
+          <w:lang w:eastAsia="ru-RU"/>
+          <w14:ligatures w14:val="none"/>
+        </w:rPr>
+        <w:t>cookie</w:t>
+      </w:r>
+      <w:proofErr w:type="spellEnd"/>
+      <w:r>
+        <w:rPr>
+          <w:rFonts w:ascii="Arial" w:eastAsia="Times New Roman" w:hAnsi="Arial" w:cs="Arial"/>
+          <w:color w:val="1F1F1F"/>
+          <w:kern w:val="0"/>
+          <w:sz w:val="39"/>
+          <w:szCs w:val="39"/>
+          <w:lang w:eastAsia="ru-RU"/>
+          <w14:ligatures w14:val="none"/>
+        </w:rPr>
+        <w:t xml:space="preserve"> через настройки своего браузера. Однако отключение некоторых файлов </w:t>
+      </w:r>
+      <w:proofErr w:type="spellStart"/>
+      <w:r>
+        <w:rPr>
+          <w:rFonts w:ascii="Arial" w:eastAsia="Times New Roman" w:hAnsi="Arial" w:cs="Arial"/>
+          <w:color w:val="1F1F1F"/>
+          <w:kern w:val="0"/>
+          <w:sz w:val="39"/>
+          <w:szCs w:val="39"/>
+          <w:lang w:eastAsia="ru-RU"/>
+          <w14:ligatures w14:val="none"/>
+        </w:rPr>
+        <w:t>cookie</w:t>
+      </w:r>
+      <w:proofErr w:type="spellEnd"/>
+      <w:r>
+        <w:rPr>
+          <w:rFonts w:ascii="Arial" w:eastAsia="Times New Roman" w:hAnsi="Arial" w:cs="Arial"/>
+          <w:color w:val="1F1F1F"/>
+          <w:kern w:val="0"/>
+          <w:sz w:val="39"/>
+          <w:szCs w:val="39"/>
+          <w:lang w:eastAsia="ru-RU"/>
+          <w14:ligatures w14:val="none"/>
+        </w:rPr>
+        <w:t xml:space="preserve"> может повлиять на функциональность сайта.</w:t>
+      </w:r>
+    </w:p>
+    <w:p>
+      <w:pPr>
+        <w:shd w:val="clear" w:color="auto" w:fill="FFFFFF"/>
+        <w:spacing w:before="100" w:beforeAutospacing="1" w:after="433" w:line="240" w:lineRule="auto"/>
+        <w:rPr>
+          <w:rFonts w:ascii="Arial" w:eastAsia="Times New Roman" w:hAnsi="Arial" w:cs="Arial"/>
+          <w:color w:val="1F1F1F"/>
+          <w:kern w:val="0"/>
+          <w:sz w:val="39"/>
+          <w:szCs w:val="39"/>
+          <w:lang w:eastAsia="ru-RU"/>
+          <w14:ligatures w14:val="none"/>
+        </w:rPr>
+      </w:pPr>
+      <w:r>
+        <w:rPr>
+          <w:rFonts w:ascii="Arial" w:eastAsia="Times New Roman" w:hAnsi="Arial" w:cs="Arial"/>
+          <w:color w:val="1F1F1F"/>
+          <w:kern w:val="0"/>
+          <w:sz w:val="39"/>
+          <w:szCs w:val="39"/>
+          <w:lang w:eastAsia="ru-RU"/>
+          <w14:ligatures w14:val="none"/>
+        </w:rPr>
+        <w:t xml:space="preserve">Оператор использует сервис </w:t>
+      </w:r>
+      <w:proofErr w:type="spellStart"/>
+      <w:r>
+        <w:rPr>
+          <w:rFonts w:ascii="Arial" w:eastAsia="Times New Roman" w:hAnsi="Arial" w:cs="Arial"/>
+          <w:color w:val="1F1F1F"/>
+          <w:kern w:val="0"/>
+          <w:sz w:val="39"/>
+          <w:szCs w:val="39"/>
+          <w:lang w:eastAsia="ru-RU"/>
+          <w14:ligatures w14:val="none"/>
+        </w:rPr>
+        <w:t>Яндекс.Метрика</w:t>
+      </w:r>
+      <w:proofErr w:type="spellEnd"/>
+      <w:r>
+        <w:rPr>
+          <w:rFonts w:ascii="Arial" w:eastAsia="Times New Roman" w:hAnsi="Arial" w:cs="Arial"/>
+          <w:color w:val="1F1F1F"/>
+          <w:kern w:val="0"/>
+          <w:sz w:val="39"/>
+          <w:szCs w:val="39"/>
+          <w:lang w:eastAsia="ru-RU"/>
+          <w14:ligatures w14:val="none"/>
+        </w:rPr>
+        <w:t xml:space="preserve"> для сбора статистики о посещаемости сайта и поведения пользователей. Этот инструмент помогает анализировать данные о просмотрах страниц, времени на сайте, источниках трафика и других метриках. Пользователь сайта может отказаться от сбора данных </w:t>
+      </w:r>
+      <w:proofErr w:type="spellStart"/>
+      <w:r>
+        <w:rPr>
+          <w:rFonts w:ascii="Arial" w:eastAsia="Times New Roman" w:hAnsi="Arial" w:cs="Arial"/>
+          <w:color w:val="1F1F1F"/>
+          <w:kern w:val="0"/>
+          <w:sz w:val="39"/>
+          <w:szCs w:val="39"/>
+          <w:lang w:eastAsia="ru-RU"/>
+          <w14:ligatures w14:val="none"/>
+        </w:rPr>
+        <w:t>Яндекс.Метрикой</w:t>
+      </w:r>
+      <w:proofErr w:type="spellEnd"/>
+      <w:r>
+        <w:rPr>
+          <w:rFonts w:ascii="Arial" w:eastAsia="Times New Roman" w:hAnsi="Arial" w:cs="Arial"/>
+          <w:color w:val="1F1F1F"/>
+          <w:kern w:val="0"/>
+          <w:sz w:val="39"/>
+          <w:szCs w:val="39"/>
+          <w:lang w:eastAsia="ru-RU"/>
+          <w14:ligatures w14:val="none"/>
+        </w:rPr>
+        <w:t xml:space="preserve"> с помощью официального инструмента отключения. </w:t>
       </w:r>
       <w:r>
         <w:rPr>
@@ -1073,34 +1337,164 @@
           <w14:ligatures w14:val="none"/>
         </w:rPr>
         <w:lastRenderedPageBreak/>
-        <w:t>Пользователь сайта может контролировать и удалять cookie через настройки своего браузера. Однако отключение некоторых файлов cookie может повлиять на функциональность сайта.</w:t>
-      </w:r>
-    </w:p>
-    <w:p>
-      <w:pPr>
-        <w:shd w:val="clear" w:color="auto" w:fill="FFFFFF"/>
-        <w:spacing w:before="100" w:beforeAutospacing="1" w:after="433" w:line="240" w:lineRule="auto"/>
-        <w:rPr>
-          <w:rFonts w:ascii="Arial" w:eastAsia="Times New Roman" w:hAnsi="Arial" w:cs="Arial"/>
-          <w:color w:val="1F1F1F"/>
-          <w:kern w:val="0"/>
-          <w:sz w:val="39"/>
-          <w:szCs w:val="39"/>
-          <w:lang w:eastAsia="ru-RU"/>
-          <w14:ligatures w14:val="none"/>
-        </w:rPr>
-      </w:pPr>
-      <w:r>
-        <w:rPr>
-          <w:rFonts w:ascii="Arial" w:eastAsia="Times New Roman" w:hAnsi="Arial" w:cs="Arial"/>
-          <w:color w:val="1F1F1F"/>
-          <w:kern w:val="0"/>
-          <w:sz w:val="39"/>
-          <w:szCs w:val="39"/>
-          <w:lang w:eastAsia="ru-RU"/>
-          <w14:ligatures w14:val="none"/>
-        </w:rPr>
-        <w:t>Оператор может использовать сервисы третьих сторон (например, Яндекс Метрика, социальные сети), которые также размещают cookie. Эти файлы регулируются политиками конфиденциальности соответствующих компаний. При первом посещении сайта Оператор запрашивает согласие пользователя сайта на использование cookie. Пользователь сайта можете изменить свои предпочтения в любое время через настройки браузера или механизм управления cookie.</w:t>
+        <w:t xml:space="preserve">Пользователь сайта может контролировать и удалять </w:t>
+      </w:r>
+      <w:proofErr w:type="spellStart"/>
+      <w:r>
+        <w:rPr>
+          <w:rFonts w:ascii="Arial" w:eastAsia="Times New Roman" w:hAnsi="Arial" w:cs="Arial"/>
+          <w:color w:val="1F1F1F"/>
+          <w:kern w:val="0"/>
+          <w:sz w:val="39"/>
+          <w:szCs w:val="39"/>
+          <w:lang w:eastAsia="ru-RU"/>
+          <w14:ligatures w14:val="none"/>
+        </w:rPr>
+        <w:t>cookie</w:t>
+      </w:r>
+      <w:proofErr w:type="spellEnd"/>
+      <w:r>
+        <w:rPr>
+          <w:rFonts w:ascii="Arial" w:eastAsia="Times New Roman" w:hAnsi="Arial" w:cs="Arial"/>
+          <w:color w:val="1F1F1F"/>
+          <w:kern w:val="0"/>
+          <w:sz w:val="39"/>
+          <w:szCs w:val="39"/>
+          <w:lang w:eastAsia="ru-RU"/>
+          <w14:ligatures w14:val="none"/>
+        </w:rPr>
+        <w:t xml:space="preserve"> через настройки своего браузера. Однако отключение некоторых файлов </w:t>
+      </w:r>
+      <w:proofErr w:type="spellStart"/>
+      <w:r>
+        <w:rPr>
+          <w:rFonts w:ascii="Arial" w:eastAsia="Times New Roman" w:hAnsi="Arial" w:cs="Arial"/>
+          <w:color w:val="1F1F1F"/>
+          <w:kern w:val="0"/>
+          <w:sz w:val="39"/>
+          <w:szCs w:val="39"/>
+          <w:lang w:eastAsia="ru-RU"/>
+          <w14:ligatures w14:val="none"/>
+        </w:rPr>
+        <w:t>cookie</w:t>
+      </w:r>
+      <w:proofErr w:type="spellEnd"/>
+      <w:r>
+        <w:rPr>
+          <w:rFonts w:ascii="Arial" w:eastAsia="Times New Roman" w:hAnsi="Arial" w:cs="Arial"/>
+          <w:color w:val="1F1F1F"/>
+          <w:kern w:val="0"/>
+          <w:sz w:val="39"/>
+          <w:szCs w:val="39"/>
+          <w:lang w:eastAsia="ru-RU"/>
+          <w14:ligatures w14:val="none"/>
+        </w:rPr>
+        <w:t xml:space="preserve"> может повлиять на функциональность сайта.</w:t>
+      </w:r>
+    </w:p>
+    <w:p>
+      <w:pPr>
+        <w:shd w:val="clear" w:color="auto" w:fill="FFFFFF"/>
+        <w:spacing w:before="100" w:beforeAutospacing="1" w:after="433" w:line="240" w:lineRule="auto"/>
+        <w:rPr>
+          <w:rFonts w:ascii="Arial" w:eastAsia="Times New Roman" w:hAnsi="Arial" w:cs="Arial"/>
+          <w:color w:val="1F1F1F"/>
+          <w:kern w:val="0"/>
+          <w:sz w:val="39"/>
+          <w:szCs w:val="39"/>
+          <w:lang w:eastAsia="ru-RU"/>
+          <w14:ligatures w14:val="none"/>
+        </w:rPr>
+      </w:pPr>
+      <w:r>
+        <w:rPr>
+          <w:rFonts w:ascii="Arial" w:eastAsia="Times New Roman" w:hAnsi="Arial" w:cs="Arial"/>
+          <w:color w:val="1F1F1F"/>
+          <w:kern w:val="0"/>
+          <w:sz w:val="39"/>
+          <w:szCs w:val="39"/>
+          <w:lang w:eastAsia="ru-RU"/>
+          <w14:ligatures w14:val="none"/>
+        </w:rPr>
+        <w:t xml:space="preserve">Оператор может использовать сервисы третьих сторон (например, Яндекс Метрика, социальные сети), которые также размещают </w:t>
+      </w:r>
+      <w:proofErr w:type="spellStart"/>
+      <w:r>
+        <w:rPr>
+          <w:rFonts w:ascii="Arial" w:eastAsia="Times New Roman" w:hAnsi="Arial" w:cs="Arial"/>
+          <w:color w:val="1F1F1F"/>
+          <w:kern w:val="0"/>
+          <w:sz w:val="39"/>
+          <w:szCs w:val="39"/>
+          <w:lang w:eastAsia="ru-RU"/>
+          <w14:ligatures w14:val="none"/>
+        </w:rPr>
+        <w:t>cookie</w:t>
+      </w:r>
+      <w:proofErr w:type="spellEnd"/>
+      <w:r>
+        <w:rPr>
+          <w:rFonts w:ascii="Arial" w:eastAsia="Times New Roman" w:hAnsi="Arial" w:cs="Arial"/>
+          <w:color w:val="1F1F1F"/>
+          <w:kern w:val="0"/>
+          <w:sz w:val="39"/>
+          <w:szCs w:val="39"/>
+          <w:lang w:eastAsia="ru-RU"/>
+          <w14:ligatures w14:val="none"/>
+        </w:rPr>
+        <w:t xml:space="preserve">. Эти файлы регулируются политиками конфиденциальности соответствующих компаний. При первом посещении сайта Оператор запрашивает согласие пользователя сайта на использование </w:t>
+      </w:r>
+      <w:proofErr w:type="spellStart"/>
+      <w:r>
+        <w:rPr>
+          <w:rFonts w:ascii="Arial" w:eastAsia="Times New Roman" w:hAnsi="Arial" w:cs="Arial"/>
+          <w:color w:val="1F1F1F"/>
+          <w:kern w:val="0"/>
+          <w:sz w:val="39"/>
+          <w:szCs w:val="39"/>
+          <w:lang w:eastAsia="ru-RU"/>
+          <w14:ligatures w14:val="none"/>
+        </w:rPr>
+        <w:t>cookie</w:t>
+      </w:r>
+      <w:proofErr w:type="spellEnd"/>
+      <w:r>
+        <w:rPr>
+          <w:rFonts w:ascii="Arial" w:eastAsia="Times New Roman" w:hAnsi="Arial" w:cs="Arial"/>
+          <w:color w:val="1F1F1F"/>
+          <w:kern w:val="0"/>
+          <w:sz w:val="39"/>
+          <w:szCs w:val="39"/>
+          <w:lang w:eastAsia="ru-RU"/>
+          <w14:ligatures w14:val="none"/>
+        </w:rPr>
+        <w:t xml:space="preserve">. Пользователь сайта можете изменить свои предпочтения в любое время через настройки браузера или механизм управления </w:t>
+      </w:r>
+      <w:proofErr w:type="spellStart"/>
+      <w:r>
+        <w:rPr>
+          <w:rFonts w:ascii="Arial" w:eastAsia="Times New Roman" w:hAnsi="Arial" w:cs="Arial"/>
+          <w:color w:val="1F1F1F"/>
+          <w:kern w:val="0"/>
+          <w:sz w:val="39"/>
+          <w:szCs w:val="39"/>
+          <w:lang w:eastAsia="ru-RU"/>
+          <w14:ligatures w14:val="none"/>
+        </w:rPr>
+        <w:t>cookie</w:t>
+      </w:r>
+      <w:proofErr w:type="spellEnd"/>
+      <w:r>
+        <w:rPr>
+          <w:rFonts w:ascii="Arial" w:eastAsia="Times New Roman" w:hAnsi="Arial" w:cs="Arial"/>
+          <w:color w:val="1F1F1F"/>
+          <w:kern w:val="0"/>
+          <w:sz w:val="39"/>
+          <w:szCs w:val="39"/>
+          <w:lang w:eastAsia="ru-RU"/>
+          <w14:ligatures w14:val="none"/>
+        </w:rPr>
+        <w:t>.</w:t>
       </w:r>
     </w:p>
     <w:p>
@@ -1183,6 +1577,7 @@
         </w:rPr>
         <w:t xml:space="preserve">• Идентификации Пользователя, зарегистрированного на сайте </w:t>
       </w:r>
+      <w:proofErr w:type="spellStart"/>
       <w:r>
         <w:rPr>
           <w:rFonts w:ascii="Arial" w:eastAsia="Times New Roman" w:hAnsi="Arial" w:cs="Arial"/>
@@ -1195,6 +1590,7 @@
         </w:rPr>
         <w:t>Xymerapeptides</w:t>
       </w:r>
+      <w:proofErr w:type="spellEnd"/>
       <w:r>
         <w:rPr>
           <w:rFonts w:ascii="Arial" w:eastAsia="Times New Roman" w:hAnsi="Arial" w:cs="Arial"/>
@@ -1217,7 +1613,7 @@
           <w:lang w:val="en-US" w:eastAsia="ru-RU"/>
           <w14:ligatures w14:val="none"/>
         </w:rPr>
-        <w:t>ru</w:t>
+        <w:t>com</w:t>
       </w:r>
       <w:r>
         <w:rPr>
@@ -1258,6 +1654,7 @@
         </w:rPr>
         <w:t xml:space="preserve">• Предоставления Пользователю доступа к персонализированным ресурсам сайта </w:t>
       </w:r>
+      <w:proofErr w:type="spellStart"/>
       <w:r>
         <w:rPr>
           <w:rFonts w:ascii="Arial" w:eastAsia="Times New Roman" w:hAnsi="Arial" w:cs="Arial"/>
@@ -1270,6 +1667,7 @@
         </w:rPr>
         <w:t>Xymerapeptides</w:t>
       </w:r>
+      <w:proofErr w:type="spellEnd"/>
       <w:r>
         <w:rPr>
           <w:rFonts w:ascii="Arial" w:eastAsia="Times New Roman" w:hAnsi="Arial" w:cs="Arial"/>
@@ -1292,7 +1690,7 @@
           <w:lang w:val="en-US" w:eastAsia="ru-RU"/>
           <w14:ligatures w14:val="none"/>
         </w:rPr>
-        <w:t>ru</w:t>
+        <w:t>com</w:t>
       </w:r>
       <w:r>
         <w:rPr>
@@ -1334,6 +1732,7 @@
         <w:lastRenderedPageBreak/>
         <w:t xml:space="preserve">• Установления с Пользователем обратной связи, включая направление уведомлений, запросов, касающихся использования сайта </w:t>
       </w:r>
+      <w:proofErr w:type="spellStart"/>
       <w:r>
         <w:rPr>
           <w:rFonts w:ascii="Arial" w:eastAsia="Times New Roman" w:hAnsi="Arial" w:cs="Arial"/>
@@ -1346,6 +1745,7 @@
         </w:rPr>
         <w:t>Xymerapeptides</w:t>
       </w:r>
+      <w:proofErr w:type="spellEnd"/>
       <w:r>
         <w:rPr>
           <w:rFonts w:ascii="Arial" w:eastAsia="Times New Roman" w:hAnsi="Arial" w:cs="Arial"/>
@@ -1368,7 +1768,7 @@
           <w:lang w:val="en-US" w:eastAsia="ru-RU"/>
           <w14:ligatures w14:val="none"/>
         </w:rPr>
-        <w:t>ru</w:t>
+        <w:t>com</w:t>
       </w:r>
       <w:r>
         <w:rPr>
@@ -1409,6 +1809,7 @@
         </w:rPr>
         <w:t xml:space="preserve">• Уведомления Пользователя сайта </w:t>
       </w:r>
+      <w:proofErr w:type="spellStart"/>
       <w:r>
         <w:rPr>
           <w:rFonts w:ascii="Arial" w:eastAsia="Times New Roman" w:hAnsi="Arial" w:cs="Arial"/>
@@ -1421,6 +1822,7 @@
         </w:rPr>
         <w:t>Xymerapeptides</w:t>
       </w:r>
+      <w:proofErr w:type="spellEnd"/>
       <w:r>
         <w:rPr>
           <w:rFonts w:ascii="Arial" w:eastAsia="Times New Roman" w:hAnsi="Arial" w:cs="Arial"/>
@@ -1443,31 +1845,19 @@
           <w:lang w:val="en-US" w:eastAsia="ru-RU"/>
           <w14:ligatures w14:val="none"/>
         </w:rPr>
-        <w:t>ru</w:t>
-      </w:r>
-      <w:r>
-        <w:rPr>
-          <w:rFonts w:ascii="Arial" w:eastAsia="Times New Roman" w:hAnsi="Arial" w:cs="Arial"/>
-          <w:color w:val="1F1F1F"/>
-          <w:kern w:val="0"/>
-          <w:sz w:val="39"/>
-          <w:szCs w:val="39"/>
-          <w:lang w:eastAsia="ru-RU"/>
-          <w14:ligatures w14:val="none"/>
-        </w:rPr>
-        <w:t xml:space="preserve"> </w:t>
-      </w:r>
-      <w:r>
-        <w:rPr>
-          <w:rFonts w:ascii="Arial" w:eastAsia="Times New Roman" w:hAnsi="Arial" w:cs="Arial"/>
-          <w:color w:val="1F1F1F"/>
-          <w:kern w:val="0"/>
-          <w:sz w:val="39"/>
-          <w:szCs w:val="39"/>
-          <w:lang w:eastAsia="ru-RU"/>
-          <w14:ligatures w14:val="none"/>
-        </w:rPr>
-        <w:t>о сведениях, касающихся оформленных заказов в личном кабинете Пользователя;</w:t>
+        <w:t>com</w:t>
+      </w:r>
+      <w:r>
+        <w:rPr>
+          <w:rFonts w:ascii="Arial" w:eastAsia="Times New Roman" w:hAnsi="Arial" w:cs="Arial"/>
+          <w:color w:val="1F1F1F"/>
+          <w:kern w:val="0"/>
+          <w:sz w:val="39"/>
+          <w:szCs w:val="39"/>
+          <w:lang w:eastAsia="ru-RU"/>
+          <w14:ligatures w14:val="none"/>
+        </w:rPr>
+        <w:t xml:space="preserve"> о сведениях, касающихся оформленных заказов в личном кабинете Пользователя;</w:t>
       </w:r>
     </w:p>
     <w:p>
@@ -1496,6 +1886,7 @@
         </w:rPr>
         <w:t xml:space="preserve">• Предоставления Пользователю эффективной клиентской и технической поддержки при возникновении проблем, связанных с использованием сайта </w:t>
       </w:r>
+      <w:proofErr w:type="spellStart"/>
       <w:r>
         <w:rPr>
           <w:rFonts w:ascii="Arial" w:eastAsia="Times New Roman" w:hAnsi="Arial" w:cs="Arial"/>
@@ -1508,6 +1899,7 @@
         </w:rPr>
         <w:t>Xymerapeptides</w:t>
       </w:r>
+      <w:proofErr w:type="spellEnd"/>
       <w:r>
         <w:rPr>
           <w:rFonts w:ascii="Arial" w:eastAsia="Times New Roman" w:hAnsi="Arial" w:cs="Arial"/>
@@ -1530,7 +1922,7 @@
           <w:lang w:val="en-US" w:eastAsia="ru-RU"/>
           <w14:ligatures w14:val="none"/>
         </w:rPr>
-        <w:t>ru</w:t>
+        <w:t>com</w:t>
       </w:r>
       <w:r>
         <w:rPr>
@@ -1571,6 +1963,7 @@
         </w:rPr>
         <w:t>• Предоставления Пользователю сообщений информационного характера, в том числе на получение кассовых чеков в электронной форме от имени https://</w:t>
       </w:r>
+      <w:proofErr w:type="spellStart"/>
       <w:r>
         <w:rPr>
           <w:rFonts w:ascii="Arial" w:eastAsia="Times New Roman" w:hAnsi="Arial" w:cs="Arial"/>
@@ -1583,6 +1976,7 @@
         </w:rPr>
         <w:t>Xymerapeptides</w:t>
       </w:r>
+      <w:proofErr w:type="spellEnd"/>
       <w:r>
         <w:rPr>
           <w:rFonts w:ascii="Arial" w:eastAsia="Times New Roman" w:hAnsi="Arial" w:cs="Arial"/>
@@ -1605,7 +1999,7 @@
           <w:lang w:val="en-US" w:eastAsia="ru-RU"/>
           <w14:ligatures w14:val="none"/>
         </w:rPr>
-        <w:t>ru</w:t>
+        <w:t>com</w:t>
       </w:r>
       <w:r>
         <w:rPr>
@@ -2001,8 +2395,22 @@
           <w:lang w:eastAsia="ru-RU"/>
           <w14:ligatures w14:val="none"/>
         </w:rPr>
-        <w:t>• Email</w:t>
-      </w:r>
+        <w:t xml:space="preserve">• </w:t>
+      </w:r>
+      <w:proofErr w:type="spellStart"/>
+      <w:r>
+        <w:rPr>
+          <w:rFonts w:ascii="Arial" w:eastAsia="Times New Roman" w:hAnsi="Arial" w:cs="Arial"/>
+          <w:color w:val="1F1F1F"/>
+          <w:kern w:val="0"/>
+          <w:sz w:val="39"/>
+          <w:szCs w:val="39"/>
+          <w:lang w:eastAsia="ru-RU"/>
+          <w14:ligatures w14:val="none"/>
+        </w:rPr>
+        <w:t>Email</w:t>
+      </w:r>
+      <w:proofErr w:type="spellEnd"/>
     </w:p>
     <w:p>
       <w:pPr>
@@ -2623,8 +3031,22 @@
           <w:lang w:eastAsia="ru-RU"/>
           <w14:ligatures w14:val="none"/>
         </w:rPr>
-        <w:t>• Email</w:t>
-      </w:r>
+        <w:t xml:space="preserve">• </w:t>
+      </w:r>
+      <w:proofErr w:type="spellStart"/>
+      <w:r>
+        <w:rPr>
+          <w:rFonts w:ascii="Arial" w:eastAsia="Times New Roman" w:hAnsi="Arial" w:cs="Arial"/>
+          <w:color w:val="1F1F1F"/>
+          <w:kern w:val="0"/>
+          <w:sz w:val="39"/>
+          <w:szCs w:val="39"/>
+          <w:lang w:eastAsia="ru-RU"/>
+          <w14:ligatures w14:val="none"/>
+        </w:rPr>
+        <w:t>Email</w:t>
+      </w:r>
+      <w:proofErr w:type="spellEnd"/>
     </w:p>
     <w:p>
       <w:pPr>
@@ -4183,20 +4605,9 @@
           <w:lang w:eastAsia="ru-RU"/>
           <w14:ligatures w14:val="none"/>
         </w:rPr>
-        <w:t>2. Действующая редакция политики конфиденциальности находится на сайте в информационно-телекоммуникационной сети "Интернет" по адресу: https://</w:t>
-      </w:r>
-      <w:r>
-        <w:rPr>
-          <w:rFonts w:ascii="Arial" w:eastAsia="Times New Roman" w:hAnsi="Arial" w:cs="Arial"/>
-          <w:color w:val="1F1F1F"/>
-          <w:kern w:val="0"/>
-          <w:sz w:val="39"/>
-          <w:szCs w:val="39"/>
-          <w:lang w:eastAsia="ru-RU"/>
-          <w14:ligatures w14:val="none"/>
-        </w:rPr>
-        <w:t xml:space="preserve"> </w:t>
-      </w:r>
+        <w:t xml:space="preserve">2. Действующая редакция политики конфиденциальности находится на сайте в информационно-телекоммуникационной сети "Интернет" по адресу: https:// </w:t>
+      </w:r>
+      <w:proofErr w:type="spellStart"/>
       <w:r>
         <w:rPr>
           <w:rFonts w:ascii="Arial" w:eastAsia="Times New Roman" w:hAnsi="Arial" w:cs="Arial"/>
@@ -4209,6 +4620,7 @@
         </w:rPr>
         <w:t>Xymerapeptides</w:t>
       </w:r>
+      <w:proofErr w:type="spellEnd"/>
       <w:r>
         <w:rPr>
           <w:rFonts w:ascii="Arial" w:eastAsia="Times New Roman" w:hAnsi="Arial" w:cs="Arial"/>
@@ -4231,7 +4643,7 @@
           <w:lang w:val="en-US" w:eastAsia="ru-RU"/>
           <w14:ligatures w14:val="none"/>
         </w:rPr>
-        <w:t>ru</w:t>
+        <w:t>com</w:t>
       </w:r>
       <w:r>
         <w:rPr>
@@ -4270,7 +4682,7 @@
           <w:lang w:eastAsia="ru-RU"/>
           <w14:ligatures w14:val="none"/>
         </w:rPr>
-        <w:t xml:space="preserve">Дата публикации политики конфиденциальности </w:t>
+        <w:t>Дата публикации политики конфиденциальности 07.</w:t>
       </w:r>
       <w:r>
         <w:rPr>
@@ -4294,30 +4706,6 @@
           <w:lang w:eastAsia="ru-RU"/>
           <w14:ligatures w14:val="none"/>
         </w:rPr>
-        <w:t>.</w:t>
-      </w:r>
-      <w:r>
-        <w:rPr>
-          <w:rFonts w:ascii="Arial" w:eastAsia="Times New Roman" w:hAnsi="Arial" w:cs="Arial"/>
-          <w:color w:val="1F1F1F"/>
-          <w:kern w:val="0"/>
-          <w:sz w:val="39"/>
-          <w:szCs w:val="39"/>
-          <w:lang w:val="en-US" w:eastAsia="ru-RU"/>
-          <w14:ligatures w14:val="none"/>
-        </w:rPr>
-        <w:t>07</w:t>
-      </w:r>
-      <w:r>
-        <w:rPr>
-          <w:rFonts w:ascii="Arial" w:eastAsia="Times New Roman" w:hAnsi="Arial" w:cs="Arial"/>
-          <w:color w:val="1F1F1F"/>
-          <w:kern w:val="0"/>
-          <w:sz w:val="39"/>
-          <w:szCs w:val="39"/>
-          <w:lang w:eastAsia="ru-RU"/>
-          <w14:ligatures w14:val="none"/>
-        </w:rPr>
         <w:t>.202</w:t>
       </w:r>
       <w:r>
@@ -4327,7 +4715,7 @@
           <w:kern w:val="0"/>
           <w:sz w:val="39"/>
           <w:szCs w:val="39"/>
-          <w:lang w:val="en-US" w:eastAsia="ru-RU"/>
+          <w:lang w:eastAsia="ru-RU"/>
           <w14:ligatures w14:val="none"/>
         </w:rPr>
         <w:t>6</w:t>

</xml_diff>